<commit_message>
docs: regenerate setup guide Word document with updated screenshots
Co-Authored-By: Claude Opus 4.6 <noreply@anthropic.com>
</commit_message>
<xml_diff>
--- a/rag-maintenance/docs/導入手順書.docx
+++ b/rag-maintenance/docs/導入手順書.docx
@@ -102,23 +102,6 @@
           <w:color w:val="000000"/>
         </w:rPr>
         <w:t>作成日 : 2026/2/10</w:t>
-      </w:r>
-    </w:p>
-    <w:p>
-      <w:pPr>
-        <w:jc w:val="center"/>
-        <w:spacing w:after="120"/>
-      </w:pPr>
-      <w:r>
-        <w:rPr>
-          <w:rFonts w:ascii="Meiryo UI" w:hAnsi="Meiryo UI" w:eastAsia="Meiryo UI" w:cs="Meiryo UI"/>
-          <w:b/>
-          <w:bCs/>
-          <w:sz w:val="21"/>
-          <w:szCs w:val="21"/>
-          <w:color w:val="000000"/>
-        </w:rPr>
-        <w:t>版数 : 2.2</w:t>
       </w:r>
     </w:p>
     <w:p>
@@ -183,6 +166,78 @@
         <w:br w:type="page"/>
       </w:r>
     </w:p>
+    <w:p>
+      <w:pPr>
+        <w:pStyle w:val="FirstParagraph"/>
+      </w:pPr>
+      <w:r>
+        <w:rPr>
+          <w:rFonts w:hint="eastAsia"/>
+          <w:b/>
+          <w:bCs/>
+        </w:rPr>
+        <w:t xml:space="preserve">文書ID</w:t>
+      </w:r>
+      <w:r>
+        <w:t xml:space="preserve">: SETUP-FAQ-IMPACT-001</w:t>
+      </w:r>
+    </w:p>
+    <w:p>
+      <w:pPr>
+        <w:pStyle w:val="BodyText"/>
+      </w:pPr>
+      <w:r>
+        <w:rPr>
+          <w:rFonts w:hint="eastAsia"/>
+          <w:b/>
+          <w:bCs/>
+        </w:rPr>
+        <w:t xml:space="preserve">版数</w:t>
+      </w:r>
+      <w:r>
+        <w:t xml:space="preserve">: 2.2</w:t>
+      </w:r>
+    </w:p>
+    <w:p>
+      <w:pPr>
+        <w:pStyle w:val="BodyText"/>
+      </w:pPr>
+      <w:r>
+        <w:rPr>
+          <w:rFonts w:hint="eastAsia"/>
+          <w:b/>
+          <w:bCs/>
+        </w:rPr>
+        <w:t xml:space="preserve">関連文書</w:t>
+      </w:r>
+      <w:r>
+        <w:t xml:space="preserve">: </w:t>
+      </w:r>
+      <w:r>
+        <w:rPr>
+          <w:rFonts w:hint="eastAsia"/>
+        </w:rPr>
+        <w:t xml:space="preserve">REQ-FAQ-IMPACT-002（Phase2</w:t>
+      </w:r>
+      <w:r>
+        <w:t xml:space="preserve"> PoC </w:t>
+      </w:r>
+      <w:r>
+        <w:rPr>
+          <w:rFonts w:hint="eastAsia"/>
+        </w:rPr>
+        <w:t xml:space="preserve">要件定義書</w:t>
+      </w:r>
+      <w:r>
+        <w:t xml:space="preserve"> </w:t>
+      </w:r>
+      <w:r>
+        <w:rPr>
+          <w:rFonts w:hint="eastAsia"/>
+        </w:rPr>
+        <w:t xml:space="preserve">v3.4）</w:t>
+      </w:r>
+    </w:p>
     <w:bookmarkStart w:id="12" w:name="概要"/>
     <w:p>
       <w:pPr>
@@ -8398,7 +8453,7 @@
         <w:rPr>
           <w:rFonts w:hint="eastAsia"/>
         </w:rPr>
-        <w:t xml:space="preserve">（ドキュメント+稲妻マーク、下部に「M365」表記）が表示されることを確認</w:t>
+        <w:t xml:space="preserve">が表示されることを確認</w:t>
       </w:r>
     </w:p>
     <w:p>
@@ -8547,10 +8602,7 @@
         <w:t xml:space="preserve">M365 Agents Toolkit アイコン</w:t>
       </w:r>
       <w:r>
-        <w:rPr>
-          <w:rFonts w:hint="eastAsia"/>
-        </w:rPr>
-        <w:t xml:space="preserve">（ドキュメント+稲妻マーク、下部に「M365」表記）をクリック</w:t>
+        <w:t xml:space="preserve">をクリック</w:t>
       </w:r>
     </w:p>
     <w:p>
@@ -11829,10 +11881,7 @@
         <w:t xml:space="preserve">M365 Agents Toolkit アイコン</w:t>
       </w:r>
       <w:r>
-        <w:rPr>
-          <w:rFonts w:hint="eastAsia"/>
-        </w:rPr>
-        <w:t xml:space="preserve">（ドキュメント+稲妻マーク、下部に「M365」表記）をクリック</w:t>
+        <w:t xml:space="preserve">をクリック</w:t>
       </w:r>
     </w:p>
     <w:p>
@@ -39494,6 +39543,364 @@
           <w:rFonts w:hint="eastAsia"/>
         </w:rPr>
         <w:t xml:space="preserve">アプリストアの「組織向けに開発」に表示される</w:t>
+      </w:r>
+    </w:p>
+    <w:p>
+      <w:pPr>
+        <w:pStyle w:val="BlockText"/>
+      </w:pPr>
+      <w:r>
+        <w:rPr>
+          <w:b/>
+          <w:bCs/>
+        </w:rPr>
+        <w:t xml:space="preserve">⚠️ Deploy と Publish </w:t>
+      </w:r>
+      <w:r>
+        <w:rPr>
+          <w:rFonts w:hint="eastAsia"/>
+          <w:b/>
+          <w:bCs/>
+        </w:rPr>
+        <w:t xml:space="preserve">の違い（運用時の注意）</w:t>
+      </w:r>
+    </w:p>
+    <w:tbl>
+      <w:tblPr>
+        <w:tblStyle w:val="Table"/>
+        <w:tblW w:type="pct" w:w="5000"/>
+        <w:tblLayout w:type="fixed"/>
+        <w:tblLook w:firstRow="1" w:lastRow="0" w:firstColumn="0" w:lastColumn="0" w:noHBand="0" w:noVBand="0" w:val="0020"/>
+        <w:tblBorders>
+          <w:top w:val="single" w:sz="4" w:space="0" w:color="000000"/>
+          <w:left w:val="single" w:sz="4" w:space="0" w:color="000000"/>
+          <w:bottom w:val="single" w:sz="4" w:space="0" w:color="000000"/>
+          <w:right w:val="single" w:sz="4" w:space="0" w:color="000000"/>
+          <w:insideH w:val="single" w:sz="4" w:space="0" w:color="000000"/>
+          <w:insideV w:val="single" w:sz="4" w:space="0" w:color="000000"/>
+        </w:tblBorders>
+        <w:jc w:val="center"/>
+      </w:tblPr>
+      <w:tblGrid>
+        <w:gridCol w:w="1357"/>
+        <w:gridCol w:w="2036"/>
+        <w:gridCol w:w="2036"/>
+        <w:gridCol w:w="2489"/>
+      </w:tblGrid>
+      <w:tr>
+        <w:trPr>
+          <w:tblHeader w:val="on"/>
+        </w:trPr>
+        <w:tc>
+          <w:tcPr>
+            <w:shd w:val="clear" w:color="auto" w:fill="2B5292"/>
+          </w:tcPr>
+          <w:tcPr/>
+          <w:p>
+            <w:pPr>
+              <w:pStyle w:val="Compact"/>
+            </w:pPr>
+            <w:r>
+              <w:rPr>
+                <w:color w:val="FFFFFF"/>
+                <w:b/>
+                <w:bCs/>
+                <w:rFonts w:hint="eastAsia"/>
+              </w:rPr>
+              <w:t xml:space="preserve">操作</w:t>
+            </w:r>
+          </w:p>
+        </w:tc>
+        <w:tc>
+          <w:tcPr>
+            <w:shd w:val="clear" w:color="auto" w:fill="2B5292"/>
+          </w:tcPr>
+          <w:tcPr/>
+          <w:p>
+            <w:pPr>
+              <w:pStyle w:val="Compact"/>
+            </w:pPr>
+            <w:r>
+              <w:rPr>
+                <w:color w:val="FFFFFF"/>
+                <w:b/>
+                <w:bCs/>
+              </w:rPr>
+              <w:t xml:space="preserve">コマンド</w:t>
+            </w:r>
+          </w:p>
+        </w:tc>
+        <w:tc>
+          <w:tcPr>
+            <w:shd w:val="clear" w:color="auto" w:fill="2B5292"/>
+          </w:tcPr>
+          <w:tcPr/>
+          <w:p>
+            <w:pPr>
+              <w:pStyle w:val="Compact"/>
+            </w:pPr>
+            <w:r>
+              <w:rPr>
+                <w:color w:val="FFFFFF"/>
+                <w:b/>
+                <w:bCs/>
+                <w:rFonts w:hint="eastAsia"/>
+              </w:rPr>
+              <w:t xml:space="preserve">更新対象</w:t>
+            </w:r>
+          </w:p>
+        </w:tc>
+        <w:tc>
+          <w:tcPr>
+            <w:shd w:val="clear" w:color="auto" w:fill="2B5292"/>
+          </w:tcPr>
+          <w:tcPr/>
+          <w:p>
+            <w:pPr>
+              <w:pStyle w:val="Compact"/>
+            </w:pPr>
+            <w:r>
+              <w:rPr>
+                <w:color w:val="FFFFFF"/>
+                <w:b/>
+                <w:bCs/>
+                <w:rFonts w:hint="eastAsia"/>
+              </w:rPr>
+              <w:t xml:space="preserve">いつ必要か</w:t>
+            </w:r>
+          </w:p>
+        </w:tc>
+      </w:tr>
+      <w:tr>
+        <w:tc>
+          <w:tcPr/>
+          <w:p>
+            <w:pPr>
+              <w:pStyle w:val="Compact"/>
+            </w:pPr>
+            <w:r>
+              <w:rPr>
+                <w:b/>
+                <w:bCs/>
+              </w:rPr>
+              <w:t xml:space="preserve">Deploy</w:t>
+            </w:r>
+          </w:p>
+        </w:tc>
+        <w:tc>
+          <w:tcPr/>
+          <w:p>
+            <w:pPr>
+              <w:pStyle w:val="Compact"/>
+            </w:pPr>
+            <w:r>
+              <w:t xml:space="preserve">M365 Agents Toolkit: Deploy</w:t>
+            </w:r>
+          </w:p>
+        </w:tc>
+        <w:tc>
+          <w:tcPr/>
+          <w:p>
+            <w:pPr>
+              <w:pStyle w:val="Compact"/>
+            </w:pPr>
+            <w:r>
+              <w:t xml:space="preserve">Azure Web App </w:t>
+            </w:r>
+            <w:r>
+              <w:rPr>
+                <w:rFonts w:hint="eastAsia"/>
+              </w:rPr>
+              <w:t xml:space="preserve">上の</w:t>
+            </w:r>
+            <w:r>
+              <w:t xml:space="preserve"> Bot </w:t>
+            </w:r>
+            <w:r>
+              <w:rPr>
+                <w:rFonts w:hint="eastAsia"/>
+              </w:rPr>
+              <w:t xml:space="preserve">コード（TypeScript）</w:t>
+            </w:r>
+          </w:p>
+        </w:tc>
+        <w:tc>
+          <w:tcPr/>
+          <w:p>
+            <w:pPr>
+              <w:pStyle w:val="Compact"/>
+            </w:pPr>
+            <w:r>
+              <w:rPr>
+                <w:rFonts w:hint="eastAsia"/>
+              </w:rPr>
+              <w:t xml:space="preserve">ソースコード（</w:t>
+            </w:r>
+            <w:r>
+              <w:rPr>
+                <w:rStyle w:val="VerbatimChar"/>
+              </w:rPr>
+              <w:t xml:space="preserve">.ts</w:t>
+            </w:r>
+            <w:r>
+              <w:t xml:space="preserve"> </w:t>
+            </w:r>
+            <w:r>
+              <w:rPr>
+                <w:rFonts w:hint="eastAsia"/>
+              </w:rPr>
+              <w:t xml:space="preserve">ファイル）を変更したとき</w:t>
+            </w:r>
+          </w:p>
+        </w:tc>
+      </w:tr>
+      <w:tr>
+        <w:tc>
+          <w:tcPr/>
+          <w:p>
+            <w:pPr>
+              <w:pStyle w:val="Compact"/>
+            </w:pPr>
+            <w:r>
+              <w:rPr>
+                <w:b/>
+                <w:bCs/>
+              </w:rPr>
+              <w:t xml:space="preserve">Publish</w:t>
+            </w:r>
+          </w:p>
+        </w:tc>
+        <w:tc>
+          <w:tcPr/>
+          <w:p>
+            <w:pPr>
+              <w:pStyle w:val="Compact"/>
+            </w:pPr>
+            <w:r>
+              <w:t xml:space="preserve">M365 Agents Toolkit: Publish</w:t>
+            </w:r>
+          </w:p>
+        </w:tc>
+        <w:tc>
+          <w:tcPr/>
+          <w:p>
+            <w:pPr>
+              <w:pStyle w:val="Compact"/>
+            </w:pPr>
+            <w:r>
+              <w:t xml:space="preserve">Teams </w:t>
+            </w:r>
+            <w:r>
+              <w:rPr>
+                <w:rFonts w:hint="eastAsia"/>
+              </w:rPr>
+              <w:t xml:space="preserve">アプリカタログ（マニフェスト、アイコン）</w:t>
+            </w:r>
+          </w:p>
+        </w:tc>
+        <w:tc>
+          <w:tcPr/>
+          <w:p>
+            <w:pPr>
+              <w:pStyle w:val="Compact"/>
+            </w:pPr>
+            <w:r>
+              <w:rPr>
+                <w:rStyle w:val="VerbatimChar"/>
+              </w:rPr>
+              <w:t xml:space="preserve">manifest.json</w:t>
+            </w:r>
+            <w:r>
+              <w:t xml:space="preserve"> </w:t>
+            </w:r>
+            <w:r>
+              <w:rPr>
+                <w:rFonts w:hint="eastAsia"/>
+              </w:rPr>
+              <w:t xml:space="preserve">やアイコン画像を変更したとき</w:t>
+            </w:r>
+          </w:p>
+        </w:tc>
+      </w:tr>
+    </w:tbl>
+    <w:p>
+      <w:pPr>
+        <w:pStyle w:val="BlockText"/>
+      </w:pPr>
+      <w:r>
+        <w:rPr>
+          <w:rFonts w:hint="eastAsia"/>
+          <w:b/>
+          <w:bCs/>
+        </w:rPr>
+        <w:t xml:space="preserve">コード変更後はまず</w:t>
+      </w:r>
+      <w:r>
+        <w:rPr>
+          <w:b/>
+          <w:bCs/>
+        </w:rPr>
+        <w:t xml:space="preserve"> Deploy → </w:t>
+      </w:r>
+      <w:r>
+        <w:rPr>
+          <w:rFonts w:hint="eastAsia"/>
+          <w:b/>
+          <w:bCs/>
+        </w:rPr>
+        <w:t xml:space="preserve">必要に応じて</w:t>
+      </w:r>
+      <w:r>
+        <w:rPr>
+          <w:b/>
+          <w:bCs/>
+        </w:rPr>
+        <w:t xml:space="preserve"> Publish</w:t>
+      </w:r>
+      <w:r>
+        <w:t xml:space="preserve"> </w:t>
+      </w:r>
+      <w:r>
+        <w:rPr>
+          <w:rFonts w:hint="eastAsia"/>
+        </w:rPr>
+        <w:t xml:space="preserve">の順で実行すること。Publish</w:t>
+      </w:r>
+      <w:r>
+        <w:t xml:space="preserve"> </w:t>
+      </w:r>
+      <w:r>
+        <w:rPr>
+          <w:rFonts w:hint="eastAsia"/>
+        </w:rPr>
+        <w:t xml:space="preserve">だけではコード変更は</w:t>
+      </w:r>
+      <w:r>
+        <w:t xml:space="preserve"> Azure </w:t>
+      </w:r>
+      <w:r>
+        <w:rPr>
+          <w:rFonts w:hint="eastAsia"/>
+        </w:rPr>
+        <w:t xml:space="preserve">に反映されない。マニフェストのみの変更（アイコン差替え、</w:t>
+      </w:r>
+      <w:r>
+        <w:rPr>
+          <w:rStyle w:val="VerbatimChar"/>
+        </w:rPr>
+        <w:t xml:space="preserve">version</w:t>
+      </w:r>
+      <w:r>
+        <w:t xml:space="preserve"> </w:t>
+      </w:r>
+      <w:r>
+        <w:rPr>
+          <w:rFonts w:hint="eastAsia"/>
+        </w:rPr>
+        <w:t xml:space="preserve">インクリメント等）の場合は</w:t>
+      </w:r>
+      <w:r>
+        <w:t xml:space="preserve"> Publish のみでよい。</w:t>
       </w:r>
     </w:p>
     <w:p>

</xml_diff>